<commit_message>
tasks I need to finish
</commit_message>
<xml_diff>
--- a/2 - task/task notes.docx
+++ b/2 - task/task notes.docx
@@ -2,57 +2,42 @@
 <file path=word/document.xml><?xml version="1.0" encoding="utf-8"?>
 <w:document xmlns:wpc="http://schemas.microsoft.com/office/word/2010/wordprocessingCanvas" xmlns:cx="http://schemas.microsoft.com/office/drawing/2014/chartex" xmlns:cx1="http://schemas.microsoft.com/office/drawing/2015/9/8/chartex" xmlns:cx2="http://schemas.microsoft.com/office/drawing/2015/10/21/chartex" xmlns:cx3="http://schemas.microsoft.com/office/drawing/2016/5/9/chartex" xmlns:cx4="http://schemas.microsoft.com/office/drawing/2016/5/10/chartex" xmlns:cx5="http://schemas.microsoft.com/office/drawing/2016/5/11/chartex" xmlns:cx6="http://schemas.microsoft.com/office/drawing/2016/5/12/chartex" xmlns:cx7="http://schemas.microsoft.com/office/drawing/2016/5/13/chartex" xmlns:cx8="http://schemas.microsoft.com/office/drawing/2016/5/14/chartex" xmlns:mc="http://schemas.openxmlformats.org/markup-compatibility/2006" xmlns:aink="http://schemas.microsoft.com/office/drawing/2016/ink" xmlns:am3d="http://schemas.microsoft.com/office/drawing/2017/model3d" xmlns:o="urn:schemas-microsoft-com:office:office" xmlns:oel="http://schemas.microsoft.com/office/2019/extlst" xmlns:r="http://schemas.openxmlformats.org/officeDocument/2006/relationships" xmlns:m="http://schemas.openxmlformats.org/officeDocument/2006/math" xmlns:v="urn:schemas-microsoft-com:vml" xmlns:wp14="http://schemas.microsoft.com/office/word/2010/wordprocessingDrawing" xmlns:wp="http://schemas.openxmlformats.org/drawingml/2006/wordprocessingDrawing" xmlns:w10="urn:schemas-microsoft-com:office:word" xmlns:w="http://schemas.openxmlformats.org/wordprocessingml/2006/main" xmlns:w14="http://schemas.microsoft.com/office/word/2010/wordml" xmlns:w15="http://schemas.microsoft.com/office/word/2012/wordml" xmlns:w16cex="http://schemas.microsoft.com/office/word/2018/wordml/cex" xmlns:w16cid="http://schemas.microsoft.com/office/word/2016/wordml/cid" xmlns:w16="http://schemas.microsoft.com/office/word/2018/wordml" xmlns:w16du="http://schemas.microsoft.com/office/word/2023/wordml/word16du" xmlns:w16sdtdh="http://schemas.microsoft.com/office/word/2020/wordml/sdtdatahash" xmlns:w16sdtfl="http://schemas.microsoft.com/office/word/2024/wordml/sdtformatlock" xmlns:w16se="http://schemas.microsoft.com/office/word/2015/wordml/symex" xmlns:wpg="http://schemas.microsoft.com/office/word/2010/wordprocessingGroup" xmlns:wpi="http://schemas.microsoft.com/office/word/2010/wordprocessingInk" xmlns:wne="http://schemas.microsoft.com/office/word/2006/wordml" xmlns:wps="http://schemas.microsoft.com/office/word/2010/wordprocessingShape" mc:Ignorable="w14 w15 w16se w16cid w16 w16cex w16sdtdh w16sdtfl w16du wp14">
   <w:body>
-    <w:p>
-      <w:r>
-        <w:fldChar w:fldCharType="begin"/>
-      </w:r>
-      <w:r>
-        <w:instrText>HYPERLINK "</w:instrText>
-      </w:r>
-      <w:r>
-        <w:instrText>https://github.com/howieWu9/ReMoA</w:instrText>
-      </w:r>
-      <w:r>
-        <w:instrText>"</w:instrText>
-      </w:r>
-      <w:r>
-        <w:fldChar w:fldCharType="separate"/>
-      </w:r>
-      <w:r>
-        <w:rPr>
-          <w:rStyle w:val="Hyperlink"/>
-        </w:rPr>
-        <w:t>https://</w:t>
-      </w:r>
-      <w:proofErr w:type="spellStart"/>
-      <w:r>
-        <w:rPr>
-          <w:rStyle w:val="Hyperlink"/>
-        </w:rPr>
-        <w:t>github.com</w:t>
-      </w:r>
-      <w:proofErr w:type="spellEnd"/>
-      <w:r>
-        <w:rPr>
-          <w:rStyle w:val="Hyperlink"/>
-        </w:rPr>
-        <w:t>/howieWu9/</w:t>
-      </w:r>
-      <w:proofErr w:type="spellStart"/>
-      <w:r>
-        <w:rPr>
-          <w:rStyle w:val="Hyperlink"/>
-        </w:rPr>
-        <w:t>ReMoA</w:t>
-      </w:r>
-      <w:proofErr w:type="spellEnd"/>
-      <w:r>
-        <w:fldChar w:fldCharType="end"/>
-      </w:r>
-    </w:p>
     <w:p/>
     <w:p>
       <w:hyperlink r:id="rId4" w:history="1">
+        <w:r>
+          <w:rPr>
+            <w:rStyle w:val="Hyperlink"/>
+          </w:rPr>
+          <w:t>https://</w:t>
+        </w:r>
+        <w:proofErr w:type="spellStart"/>
+        <w:r>
+          <w:rPr>
+            <w:rStyle w:val="Hyperlink"/>
+          </w:rPr>
+          <w:t>github.com</w:t>
+        </w:r>
+        <w:proofErr w:type="spellEnd"/>
+        <w:r>
+          <w:rPr>
+            <w:rStyle w:val="Hyperlink"/>
+          </w:rPr>
+          <w:t>/howieWu9/</w:t>
+        </w:r>
+        <w:proofErr w:type="spellStart"/>
+        <w:r>
+          <w:rPr>
+            <w:rStyle w:val="Hyperlink"/>
+          </w:rPr>
+          <w:t>ReMoA</w:t>
+        </w:r>
+        <w:proofErr w:type="spellEnd"/>
+      </w:hyperlink>
+    </w:p>
+    <w:p/>
+    <w:p>
+      <w:hyperlink r:id="rId5" w:history="1">
         <w:r>
           <w:rPr>
             <w:rStyle w:val="Hyperlink"/>
@@ -106,6 +91,9 @@
     <w:p/>
     <w:p>
       <w:r>
+        <w:rPr>
+          <w:noProof/>
+        </w:rPr>
         <w:drawing>
           <wp:inline distT="0" distB="0" distL="0" distR="0" wp14:anchorId="29CBEC1A" wp14:editId="65F31C34">
             <wp:extent cx="1778000" cy="177800"/>
@@ -122,7 +110,7 @@
                     <pic:cNvPicPr/>
                   </pic:nvPicPr>
                   <pic:blipFill>
-                    <a:blip r:embed="rId5">
+                    <a:blip r:embed="rId6">
                       <a:extLst>
                         <a:ext uri="{28A0092B-C50C-407E-A947-70E740481C1C}">
                           <a14:useLocalDpi xmlns:a14="http://schemas.microsoft.com/office/drawing/2010/main" val="0"/>
@@ -205,14 +193,809 @@
       <w:proofErr w:type="spellEnd"/>
     </w:p>
     <w:p/>
+    <w:p>
+      <w:r>
+        <w:rPr>
+          <w:noProof/>
+        </w:rPr>
+        <w:drawing>
+          <wp:inline distT="0" distB="0" distL="0" distR="0" wp14:anchorId="5C762139" wp14:editId="6B92FEDE">
+            <wp:extent cx="5731510" cy="2897505"/>
+            <wp:effectExtent l="0" t="0" r="0" b="0"/>
+            <wp:docPr id="1708013982" name="Picture 1" descr="A screenshot of a review&#10;&#10;AI-generated content may be incorrect."/>
+            <wp:cNvGraphicFramePr>
+              <a:graphicFrameLocks xmlns:a="http://schemas.openxmlformats.org/drawingml/2006/main" noChangeAspect="1"/>
+            </wp:cNvGraphicFramePr>
+            <a:graphic xmlns:a="http://schemas.openxmlformats.org/drawingml/2006/main">
+              <a:graphicData uri="http://schemas.openxmlformats.org/drawingml/2006/picture">
+                <pic:pic xmlns:pic="http://schemas.openxmlformats.org/drawingml/2006/picture">
+                  <pic:nvPicPr>
+                    <pic:cNvPr id="1708013982" name="Picture 1" descr="A screenshot of a review&#10;&#10;AI-generated content may be incorrect."/>
+                    <pic:cNvPicPr/>
+                  </pic:nvPicPr>
+                  <pic:blipFill>
+                    <a:blip r:embed="rId7" cstate="print">
+                      <a:extLst>
+                        <a:ext uri="{28A0092B-C50C-407E-A947-70E740481C1C}">
+                          <a14:useLocalDpi xmlns:a14="http://schemas.microsoft.com/office/drawing/2010/main" val="0"/>
+                        </a:ext>
+                      </a:extLst>
+                    </a:blip>
+                    <a:stretch>
+                      <a:fillRect/>
+                    </a:stretch>
+                  </pic:blipFill>
+                  <pic:spPr>
+                    <a:xfrm>
+                      <a:off x="0" y="0"/>
+                      <a:ext cx="5731510" cy="2897505"/>
+                    </a:xfrm>
+                    <a:prstGeom prst="rect">
+                      <a:avLst/>
+                    </a:prstGeom>
+                  </pic:spPr>
+                </pic:pic>
+              </a:graphicData>
+            </a:graphic>
+          </wp:inline>
+        </w:drawing>
+      </w:r>
+    </w:p>
     <w:p/>
     <w:p/>
     <w:p/>
     <w:p/>
     <w:p/>
+    <w:p/>
+    <w:p>
+      <w:r>
+        <w:t>Index Terms—Query Generation; Mixture of Assessors; Rein-</w:t>
+      </w:r>
+      <w:proofErr w:type="spellStart"/>
+      <w:r>
+        <w:t>forcement</w:t>
+      </w:r>
+      <w:proofErr w:type="spellEnd"/>
+      <w:r>
+        <w:t xml:space="preserve"> Learning; Document Retrieval; Neural </w:t>
+      </w:r>
+      <w:proofErr w:type="gramStart"/>
+      <w:r>
+        <w:t>Rankers;</w:t>
+      </w:r>
+      <w:proofErr w:type="gramEnd"/>
+    </w:p>
+    <w:p>
+      <w:r>
+        <w:t>P</w:t>
+      </w:r>
+      <w:r>
+        <w:rPr>
+          <w:rFonts w:hint="eastAsia"/>
+        </w:rPr>
+        <w:t>aper</w:t>
+      </w:r>
+      <w:r>
+        <w:rPr>
+          <w:rFonts w:hint="eastAsia"/>
+        </w:rPr>
+        <w:t>搜索关键字：</w:t>
+      </w:r>
+    </w:p>
+    <w:p>
+      <w:r>
+        <w:t>Competitively Learning a Mixture-of-Experts</w:t>
+      </w:r>
+    </w:p>
+    <w:p>
+      <w:r>
+        <w:t>Mixture of Experts (</w:t>
+      </w:r>
+      <w:proofErr w:type="spellStart"/>
+      <w:r>
+        <w:t>MoE</w:t>
+      </w:r>
+      <w:proofErr w:type="spellEnd"/>
+      <w:r>
+        <w:t>)</w:t>
+      </w:r>
+    </w:p>
+    <w:p>
+      <w:r>
+        <w:rPr>
+          <w:rFonts w:hint="eastAsia"/>
+        </w:rPr>
+        <w:t>Mixture of Assessors (</w:t>
+      </w:r>
+      <w:proofErr w:type="spellStart"/>
+      <w:r>
+        <w:rPr>
+          <w:rFonts w:hint="eastAsia"/>
+        </w:rPr>
+        <w:t>MoA</w:t>
+      </w:r>
+      <w:proofErr w:type="spellEnd"/>
+      <w:r>
+        <w:rPr>
+          <w:rFonts w:hint="eastAsia"/>
+        </w:rPr>
+        <w:t>)</w:t>
+      </w:r>
+    </w:p>
+    <w:p>
+      <w:r>
+        <w:t>Expert Routing / Gating Mechanism</w:t>
+      </w:r>
+    </w:p>
+    <w:p>
+      <w:pPr>
+        <w:rPr>
+          <w:rFonts w:ascii="SimSun" w:eastAsia="SimSun" w:hAnsi="SimSun" w:cs="SimSun"/>
+          <w:b/>
+          <w:bCs/>
+          <w:color w:val="303030"/>
+          <w:sz w:val="21"/>
+          <w:szCs w:val="21"/>
+          <w:shd w:val="clear" w:color="auto" w:fill="FFFFFF"/>
+        </w:rPr>
+      </w:pPr>
+      <w:r>
+        <w:rPr>
+          <w:rFonts w:ascii="Google Sans Text" w:hAnsi="Google Sans Text"/>
+          <w:b/>
+          <w:bCs/>
+          <w:color w:val="303030"/>
+          <w:sz w:val="21"/>
+          <w:szCs w:val="21"/>
+          <w:shd w:val="clear" w:color="auto" w:fill="FFFFFF"/>
+        </w:rPr>
+        <w:t>博弈论与竞争类关键词</w:t>
+      </w:r>
+      <w:r>
+        <w:rPr>
+          <w:rFonts w:ascii="SimSun" w:eastAsia="SimSun" w:hAnsi="SimSun" w:cs="SimSun" w:hint="eastAsia"/>
+          <w:b/>
+          <w:bCs/>
+          <w:color w:val="303030"/>
+          <w:sz w:val="21"/>
+          <w:szCs w:val="21"/>
+          <w:shd w:val="clear" w:color="auto" w:fill="FFFFFF"/>
+        </w:rPr>
+        <w:t>：</w:t>
+      </w:r>
+    </w:p>
+    <w:p>
+      <w:r>
+        <w:rPr>
+          <w:rFonts w:hint="eastAsia"/>
+        </w:rPr>
+        <w:t>Competitive Learning</w:t>
+      </w:r>
+      <w:r>
+        <w:rPr>
+          <w:rFonts w:hint="eastAsia"/>
+        </w:rPr>
+        <w:t>（竞争性学习）</w:t>
+      </w:r>
+    </w:p>
+    <w:p>
+      <w:r>
+        <w:t>Nash Equilibrium</w:t>
+      </w:r>
+      <w:r>
+        <w:rPr>
+          <w:rFonts w:hint="eastAsia"/>
+        </w:rPr>
+        <w:t>（纳什均衡）</w:t>
+      </w:r>
+    </w:p>
+    <w:p>
+      <w:r>
+        <w:t>Minimax Game / Adversarial Training</w:t>
+      </w:r>
+      <w:r>
+        <w:rPr>
+          <w:rFonts w:hint="eastAsia"/>
+        </w:rPr>
+        <w:t>（极小极大博弈</w:t>
+      </w:r>
+      <w:r>
+        <w:t>/</w:t>
+      </w:r>
+      <w:r>
+        <w:rPr>
+          <w:rFonts w:hint="eastAsia"/>
+        </w:rPr>
+        <w:t>对抗训练）</w:t>
+      </w:r>
+    </w:p>
+    <w:p>
+      <w:r>
+        <w:t>Zero-sum / Non-zero-sum Game</w:t>
+      </w:r>
+      <w:r>
+        <w:rPr>
+          <w:rFonts w:hint="eastAsia"/>
+        </w:rPr>
+        <w:t>（零和</w:t>
+      </w:r>
+      <w:r>
+        <w:t>/</w:t>
+      </w:r>
+      <w:r>
+        <w:rPr>
+          <w:rFonts w:hint="eastAsia"/>
+        </w:rPr>
+        <w:t>非零和博弈）</w:t>
+      </w:r>
+    </w:p>
+    <w:p>
+      <w:r>
+        <w:t>Cooperative Game Theory</w:t>
+      </w:r>
+      <w:r>
+        <w:rPr>
+          <w:rFonts w:hint="eastAsia"/>
+        </w:rPr>
+        <w:t>（合作博弈论）</w:t>
+      </w:r>
+    </w:p>
+    <w:p>
+      <w:r>
+        <w:rPr>
+          <w:rFonts w:hint="eastAsia"/>
+        </w:rPr>
+        <w:t>问题</w:t>
+      </w:r>
+      <w:r>
+        <w:rPr>
+          <w:rFonts w:hint="eastAsia"/>
+        </w:rPr>
+        <w:t>/</w:t>
+      </w:r>
+      <w:r>
+        <w:rPr>
+          <w:rFonts w:hint="eastAsia"/>
+        </w:rPr>
+        <w:t>目标类关键词：</w:t>
+      </w:r>
+    </w:p>
+    <w:p>
+      <w:r>
+        <w:t>Expert Collapse / Assessor Dominance</w:t>
+      </w:r>
+      <w:r>
+        <w:rPr>
+          <w:rFonts w:hint="eastAsia"/>
+        </w:rPr>
+        <w:t>（专家坍缩</w:t>
+      </w:r>
+      <w:r>
+        <w:t>/</w:t>
+      </w:r>
+      <w:r>
+        <w:rPr>
+          <w:rFonts w:hint="eastAsia"/>
+        </w:rPr>
+        <w:t>评估者主导）</w:t>
+      </w:r>
+    </w:p>
+    <w:p>
+      <w:r>
+        <w:t>Diversity Preservation</w:t>
+      </w:r>
+      <w:r>
+        <w:rPr>
+          <w:rFonts w:hint="eastAsia"/>
+        </w:rPr>
+        <w:t>（多样性保持）</w:t>
+      </w:r>
+    </w:p>
+    <w:p>
+      <w:r>
+        <w:t>Multi-objective Optimization</w:t>
+      </w:r>
+      <w:r>
+        <w:rPr>
+          <w:rFonts w:hint="eastAsia"/>
+        </w:rPr>
+        <w:t>（多目标优化）</w:t>
+      </w:r>
+    </w:p>
+    <w:p>
+      <w:r>
+        <w:t>Balancing Experts</w:t>
+      </w:r>
+      <w:r>
+        <w:rPr>
+          <w:rFonts w:hint="eastAsia"/>
+        </w:rPr>
+        <w:t>（专家平衡）</w:t>
+      </w:r>
+    </w:p>
+    <w:p>
+      <w:r>
+        <w:rPr>
+          <w:rFonts w:hint="eastAsia"/>
+        </w:rPr>
+        <w:t xml:space="preserve">2. </w:t>
+      </w:r>
+      <w:r>
+        <w:rPr>
+          <w:rFonts w:hint="eastAsia"/>
+        </w:rPr>
+        <w:t>建议搜索的特定论文思路</w:t>
+      </w:r>
+    </w:p>
+    <w:p>
+      <w:r>
+        <w:rPr>
+          <w:rFonts w:hint="eastAsia"/>
+        </w:rPr>
+        <w:t>根据来源，你可以重点关注以下两个方向，它们在</w:t>
+      </w:r>
+      <w:r>
+        <w:rPr>
+          <w:rFonts w:hint="eastAsia"/>
+        </w:rPr>
+        <w:t xml:space="preserve"> </w:t>
+      </w:r>
+      <w:proofErr w:type="spellStart"/>
+      <w:r>
+        <w:rPr>
+          <w:rFonts w:hint="eastAsia"/>
+        </w:rPr>
+        <w:t>NeurIPS</w:t>
+      </w:r>
+      <w:proofErr w:type="spellEnd"/>
+      <w:r>
+        <w:rPr>
+          <w:rFonts w:hint="eastAsia"/>
+        </w:rPr>
+        <w:t xml:space="preserve"> </w:t>
+      </w:r>
+      <w:r>
+        <w:rPr>
+          <w:rFonts w:hint="eastAsia"/>
+        </w:rPr>
+        <w:t>或</w:t>
+      </w:r>
+      <w:r>
+        <w:rPr>
+          <w:rFonts w:hint="eastAsia"/>
+        </w:rPr>
+        <w:t xml:space="preserve"> ACL </w:t>
+      </w:r>
+      <w:r>
+        <w:rPr>
+          <w:rFonts w:hint="eastAsia"/>
+        </w:rPr>
+        <w:t>上非常热门：</w:t>
+      </w:r>
+    </w:p>
+    <w:p>
+      <w:r>
+        <w:rPr>
+          <w:rFonts w:hint="eastAsia"/>
+        </w:rPr>
+        <w:t>•</w:t>
+      </w:r>
+      <w:r>
+        <w:rPr>
+          <w:rFonts w:hint="eastAsia"/>
+        </w:rPr>
+        <w:t xml:space="preserve"> </w:t>
+      </w:r>
+      <w:r>
+        <w:rPr>
+          <w:rFonts w:hint="eastAsia"/>
+        </w:rPr>
+        <w:t>竞争性</w:t>
+      </w:r>
+      <w:r>
+        <w:rPr>
+          <w:rFonts w:hint="eastAsia"/>
+        </w:rPr>
+        <w:t xml:space="preserve"> </w:t>
+      </w:r>
+      <w:proofErr w:type="spellStart"/>
+      <w:r>
+        <w:rPr>
+          <w:rFonts w:hint="eastAsia"/>
+        </w:rPr>
+        <w:t>MoE</w:t>
+      </w:r>
+      <w:proofErr w:type="spellEnd"/>
+      <w:r>
+        <w:rPr>
+          <w:rFonts w:hint="eastAsia"/>
+        </w:rPr>
+        <w:t xml:space="preserve"> (Competitive </w:t>
+      </w:r>
+      <w:proofErr w:type="spellStart"/>
+      <w:r>
+        <w:rPr>
+          <w:rFonts w:hint="eastAsia"/>
+        </w:rPr>
+        <w:t>MoE</w:t>
+      </w:r>
+      <w:proofErr w:type="spellEnd"/>
+      <w:r>
+        <w:rPr>
+          <w:rFonts w:hint="eastAsia"/>
+        </w:rPr>
+        <w:t>)</w:t>
+      </w:r>
+      <w:r>
+        <w:rPr>
+          <w:rFonts w:hint="eastAsia"/>
+        </w:rPr>
+        <w:t>：</w:t>
+      </w:r>
+      <w:r>
+        <w:rPr>
+          <w:rFonts w:hint="eastAsia"/>
+        </w:rPr>
+        <w:t xml:space="preserve"> </w:t>
+      </w:r>
+      <w:r>
+        <w:rPr>
+          <w:rFonts w:hint="eastAsia"/>
+        </w:rPr>
+        <w:t>搜索如何让多个专家在竞争资源或权重时达到一种平衡。例如，来源中提到的</w:t>
+      </w:r>
+      <w:r>
+        <w:rPr>
+          <w:rFonts w:hint="eastAsia"/>
+        </w:rPr>
+        <w:t xml:space="preserve"> CAME (Competitively learning a mixture-of-experts </w:t>
+      </w:r>
+      <w:r>
+        <w:rPr>
+          <w:rFonts w:hint="eastAsia"/>
+        </w:rPr>
+        <w:lastRenderedPageBreak/>
+        <w:t xml:space="preserve">model) </w:t>
+      </w:r>
+      <w:r>
+        <w:rPr>
+          <w:rFonts w:hint="eastAsia"/>
+        </w:rPr>
+        <w:t>就是发表在</w:t>
+      </w:r>
+      <w:r>
+        <w:rPr>
+          <w:rFonts w:hint="eastAsia"/>
+        </w:rPr>
+        <w:t xml:space="preserve"> TOIS</w:t>
+      </w:r>
+      <w:r>
+        <w:rPr>
+          <w:rFonts w:hint="eastAsia"/>
+        </w:rPr>
+        <w:t>（检索顶刊）上的典型案例，其思路非常适合迁移到顶会论文。</w:t>
+      </w:r>
+    </w:p>
+    <w:p>
+      <w:r>
+        <w:rPr>
+          <w:rFonts w:hint="eastAsia"/>
+        </w:rPr>
+        <w:t>•</w:t>
+      </w:r>
+      <w:r>
+        <w:rPr>
+          <w:rFonts w:hint="eastAsia"/>
+        </w:rPr>
+        <w:t xml:space="preserve"> </w:t>
+      </w:r>
+      <w:r>
+        <w:rPr>
+          <w:rFonts w:hint="eastAsia"/>
+        </w:rPr>
+        <w:t>多目标强化学习与博弈</w:t>
+      </w:r>
+      <w:r>
+        <w:rPr>
+          <w:rFonts w:hint="eastAsia"/>
+        </w:rPr>
+        <w:t xml:space="preserve"> (Multi-objective RL &amp; Games)</w:t>
+      </w:r>
+      <w:r>
+        <w:rPr>
+          <w:rFonts w:hint="eastAsia"/>
+        </w:rPr>
+        <w:t>：</w:t>
+      </w:r>
+      <w:r>
+        <w:rPr>
+          <w:rFonts w:hint="eastAsia"/>
+        </w:rPr>
+        <w:t xml:space="preserve"> </w:t>
+      </w:r>
+      <w:proofErr w:type="spellStart"/>
+      <w:r>
+        <w:rPr>
+          <w:rFonts w:hint="eastAsia"/>
+        </w:rPr>
+        <w:t>ReMoA</w:t>
+      </w:r>
+      <w:proofErr w:type="spellEnd"/>
+      <w:r>
+        <w:rPr>
+          <w:rFonts w:hint="eastAsia"/>
+        </w:rPr>
+        <w:t xml:space="preserve"> </w:t>
+      </w:r>
+      <w:r>
+        <w:rPr>
+          <w:rFonts w:hint="eastAsia"/>
+        </w:rPr>
+        <w:t>目前使用强化学习和协方差正则化来对齐多个目标。你可以搜索</w:t>
+      </w:r>
+      <w:r>
+        <w:rPr>
+          <w:rFonts w:hint="eastAsia"/>
+        </w:rPr>
+        <w:t xml:space="preserve"> Multi-objective Reinforcement Learning with Game Theory</w:t>
+      </w:r>
+      <w:r>
+        <w:rPr>
+          <w:rFonts w:hint="eastAsia"/>
+        </w:rPr>
+        <w:t>，看看如何用博弈论代替传统的标量化奖励（</w:t>
+      </w:r>
+      <w:r>
+        <w:rPr>
+          <w:rFonts w:hint="eastAsia"/>
+        </w:rPr>
+        <w:t>Scalarization</w:t>
+      </w:r>
+      <w:r>
+        <w:rPr>
+          <w:rFonts w:hint="eastAsia"/>
+        </w:rPr>
+        <w:t>），来处理如可检索性、判别性、可回答性和覆盖率之间的冲突。</w:t>
+      </w:r>
+    </w:p>
+    <w:p>
+      <w:r>
+        <w:rPr>
+          <w:rFonts w:hint="eastAsia"/>
+        </w:rPr>
+        <w:t xml:space="preserve">3. </w:t>
+      </w:r>
+      <w:r>
+        <w:rPr>
+          <w:rFonts w:hint="eastAsia"/>
+        </w:rPr>
+        <w:t>推荐关注的顶会与特定领域</w:t>
+      </w:r>
+    </w:p>
+    <w:p>
+      <w:r>
+        <w:rPr>
+          <w:rFonts w:hint="eastAsia"/>
+        </w:rPr>
+        <w:t>•</w:t>
+      </w:r>
+      <w:r>
+        <w:rPr>
+          <w:rFonts w:hint="eastAsia"/>
+        </w:rPr>
+        <w:t xml:space="preserve"> </w:t>
+      </w:r>
+      <w:proofErr w:type="spellStart"/>
+      <w:r>
+        <w:rPr>
+          <w:rFonts w:hint="eastAsia"/>
+        </w:rPr>
+        <w:t>NeurIPS</w:t>
+      </w:r>
+      <w:proofErr w:type="spellEnd"/>
+      <w:r>
+        <w:rPr>
+          <w:rFonts w:hint="eastAsia"/>
+        </w:rPr>
+        <w:t xml:space="preserve"> / ICML</w:t>
+      </w:r>
+      <w:r>
+        <w:rPr>
+          <w:rFonts w:hint="eastAsia"/>
+        </w:rPr>
+        <w:t>：</w:t>
+      </w:r>
+      <w:r>
+        <w:rPr>
+          <w:rFonts w:hint="eastAsia"/>
+        </w:rPr>
+        <w:t xml:space="preserve"> </w:t>
+      </w:r>
+      <w:r>
+        <w:rPr>
+          <w:rFonts w:hint="eastAsia"/>
+        </w:rPr>
+        <w:t>关注</w:t>
+      </w:r>
+      <w:r>
+        <w:rPr>
+          <w:rFonts w:hint="eastAsia"/>
+        </w:rPr>
+        <w:t xml:space="preserve"> </w:t>
+      </w:r>
+      <w:proofErr w:type="spellStart"/>
+      <w:r>
+        <w:rPr>
+          <w:rFonts w:hint="eastAsia"/>
+        </w:rPr>
+        <w:t>MoE</w:t>
+      </w:r>
+      <w:proofErr w:type="spellEnd"/>
+      <w:r>
+        <w:rPr>
+          <w:rFonts w:hint="eastAsia"/>
+        </w:rPr>
+        <w:t xml:space="preserve"> </w:t>
+      </w:r>
+      <w:r>
+        <w:rPr>
+          <w:rFonts w:hint="eastAsia"/>
+        </w:rPr>
+        <w:t>路由（</w:t>
+      </w:r>
+      <w:r>
+        <w:rPr>
+          <w:rFonts w:hint="eastAsia"/>
+        </w:rPr>
+        <w:t>Routing</w:t>
+      </w:r>
+      <w:r>
+        <w:rPr>
+          <w:rFonts w:hint="eastAsia"/>
+        </w:rPr>
+        <w:t>）</w:t>
+      </w:r>
+      <w:r>
+        <w:rPr>
+          <w:rFonts w:hint="eastAsia"/>
+        </w:rPr>
+        <w:t xml:space="preserve"> </w:t>
+      </w:r>
+      <w:r>
+        <w:rPr>
+          <w:rFonts w:hint="eastAsia"/>
+        </w:rPr>
+        <w:t>的数学基础和博弈论在优化中的应用。</w:t>
+      </w:r>
+    </w:p>
+    <w:p>
+      <w:r>
+        <w:rPr>
+          <w:rFonts w:hint="eastAsia"/>
+        </w:rPr>
+        <w:t>•</w:t>
+      </w:r>
+      <w:r>
+        <w:rPr>
+          <w:rFonts w:hint="eastAsia"/>
+        </w:rPr>
+        <w:t xml:space="preserve"> ACL / EMNLP</w:t>
+      </w:r>
+      <w:r>
+        <w:rPr>
+          <w:rFonts w:hint="eastAsia"/>
+        </w:rPr>
+        <w:t>：</w:t>
+      </w:r>
+      <w:r>
+        <w:rPr>
+          <w:rFonts w:hint="eastAsia"/>
+        </w:rPr>
+        <w:t xml:space="preserve"> </w:t>
+      </w:r>
+      <w:r>
+        <w:rPr>
+          <w:rFonts w:hint="eastAsia"/>
+        </w:rPr>
+        <w:t>关注</w:t>
+      </w:r>
+      <w:r>
+        <w:rPr>
+          <w:rFonts w:hint="eastAsia"/>
+        </w:rPr>
+        <w:t>**</w:t>
+      </w:r>
+      <w:r>
+        <w:rPr>
+          <w:rFonts w:hint="eastAsia"/>
+        </w:rPr>
+        <w:t>合成查询生成（</w:t>
+      </w:r>
+      <w:r>
+        <w:rPr>
+          <w:rFonts w:hint="eastAsia"/>
+        </w:rPr>
+        <w:t>Query Generation</w:t>
+      </w:r>
+      <w:r>
+        <w:rPr>
+          <w:rFonts w:hint="eastAsia"/>
+        </w:rPr>
+        <w:t>）</w:t>
+      </w:r>
+      <w:r>
+        <w:rPr>
+          <w:rFonts w:hint="eastAsia"/>
+        </w:rPr>
+        <w:t>**</w:t>
+      </w:r>
+      <w:r>
+        <w:rPr>
+          <w:rFonts w:hint="eastAsia"/>
+        </w:rPr>
+        <w:t>中的多样性平衡问题。</w:t>
+      </w:r>
+    </w:p>
+    <w:p>
+      <w:r>
+        <w:rPr>
+          <w:rFonts w:hint="eastAsia"/>
+        </w:rPr>
+        <w:t>•</w:t>
+      </w:r>
+      <w:r>
+        <w:rPr>
+          <w:rFonts w:hint="eastAsia"/>
+        </w:rPr>
+        <w:t xml:space="preserve"> SIGIR / WWW</w:t>
+      </w:r>
+      <w:r>
+        <w:rPr>
+          <w:rFonts w:hint="eastAsia"/>
+        </w:rPr>
+        <w:t>：</w:t>
+      </w:r>
+      <w:r>
+        <w:rPr>
+          <w:rFonts w:hint="eastAsia"/>
+        </w:rPr>
+        <w:t xml:space="preserve"> </w:t>
+      </w:r>
+      <w:r>
+        <w:rPr>
+          <w:rFonts w:hint="eastAsia"/>
+        </w:rPr>
+        <w:t>关注</w:t>
+      </w:r>
+      <w:r>
+        <w:rPr>
+          <w:rFonts w:hint="eastAsia"/>
+        </w:rPr>
+        <w:t xml:space="preserve"> M2oERank</w:t>
+      </w:r>
+      <w:r>
+        <w:rPr>
+          <w:rFonts w:hint="eastAsia"/>
+        </w:rPr>
+        <w:t>（多目标专家混合排序）</w:t>
+      </w:r>
+      <w:r>
+        <w:rPr>
+          <w:rFonts w:hint="eastAsia"/>
+        </w:rPr>
+        <w:t xml:space="preserve"> </w:t>
+      </w:r>
+      <w:r>
+        <w:rPr>
+          <w:rFonts w:hint="eastAsia"/>
+        </w:rPr>
+        <w:t>等将博弈或多专家机制应用于实际搜索任务的文章。</w:t>
+      </w:r>
+    </w:p>
+    <w:p/>
     <w:sectPr>
       <w:pgSz w:w="11906" w:h="16838"/>
-      <w:pgMar w:top="1440" w:right="1440" w:bottom="1440" w:left="1440" w:header="708" w:footer="708" w:gutter="0"/>
+      <w:pgMar w:top="1440" w:right="1440" w:bottom="1440" w:left="1440" w:header="709" w:footer="709" w:gutter="0"/>
       <w:cols w:space="708"/>
       <w:docGrid w:linePitch="360"/>
     </w:sectPr>
@@ -1160,6 +1943,18 @@
       <w:shd w:val="clear" w:color="auto" w:fill="E1DFDD"/>
     </w:rPr>
   </w:style>
+  <w:style w:type="character" w:styleId="FollowedHyperlink">
+    <w:name w:val="FollowedHyperlink"/>
+    <w:basedOn w:val="DefaultParagraphFont"/>
+    <w:uiPriority w:val="99"/>
+    <w:semiHidden/>
+    <w:unhideWhenUsed/>
+    <w:rsid w:val="00537A53"/>
+    <w:rPr>
+      <w:color w:val="96607D" w:themeColor="followedHyperlink"/>
+      <w:u w:val="single"/>
+    </w:rPr>
+  </w:style>
 </w:styles>
 </file>
 

</xml_diff>